<commit_message>
Add ambassador shipment view and rejected-notes panel
Show ambassadors their shipment/tracking details in the portal overview, add private reconsideration notes for rejected applications in admin, and include updated ambassador letter content for shipment communications.

Co-authored-by: Copilot <223556219+Copilot@users.noreply.github.com>
</commit_message>
<xml_diff>
--- a/src/lib/ambassadorletter/Gelitup Ambassador Letter.docx
+++ b/src/lib/ambassadorletter/Gelitup Ambassador Letter.docx
@@ -4,7 +4,7 @@
   <w:body>
     <w:p>
       <w:pPr>
-        <w:spacing w:after="160"/>
+        <w:spacing w:after="100"/>
         <w:jc w:val="center"/>
       </w:pPr>
       <w:r>
@@ -12,8 +12,8 @@
           <w:noProof/>
         </w:rPr>
         <w:drawing>
-          <wp:inline distT="0" distB="0" distL="0" distR="0" wp14:anchorId="76B644C5" wp14:editId="49794203">
-            <wp:extent cx="1905000" cy="1447800"/>
+          <wp:inline distT="0" distB="0" distL="0" distR="0" wp14:anchorId="03B5E548" wp14:editId="7429A065">
+            <wp:extent cx="1619250" cy="1238250"/>
             <wp:effectExtent l="0" t="0" r="0" b="0"/>
             <wp:docPr id="1" name="Picture 1"/>
             <wp:cNvGraphicFramePr>
@@ -38,7 +38,7 @@
                   <pic:spPr bwMode="auto">
                     <a:xfrm>
                       <a:off x="0" y="0"/>
-                      <a:ext cx="1905000" cy="1447800"/>
+                      <a:ext cx="1619250" cy="1238250"/>
                     </a:xfrm>
                     <a:prstGeom prst="rect">
                       <a:avLst/>
@@ -67,7 +67,7 @@
     </w:p>
     <w:p>
       <w:pPr>
-        <w:spacing w:after="200"/>
+        <w:spacing w:after="160"/>
         <w:jc w:val="center"/>
       </w:pPr>
       <w:r>
@@ -84,60 +84,42 @@
         <w:pBdr>
           <w:bottom w:val="single" w:sz="16" w:space="1" w:color="C34283"/>
         </w:pBdr>
-        <w:spacing w:after="300"/>
-      </w:pPr>
-    </w:p>
-    <w:p>
-      <w:pPr>
-        <w:spacing w:after="240"/>
+        <w:spacing w:after="220"/>
+      </w:pPr>
+    </w:p>
+    <w:p>
+      <w:pPr>
+        <w:spacing w:after="200"/>
       </w:pPr>
       <w:r>
         <w:rPr>
           <w:b/>
           <w:bCs/>
-          <w:sz w:val="30"/>
-          <w:szCs w:val="30"/>
+          <w:sz w:val="28"/>
+          <w:szCs w:val="28"/>
         </w:rPr>
-        <w:t>Welcome to the family</w:t>
-      </w:r>
-      <w:r>
-        <w:rPr>
-          <w:b/>
-          <w:bCs/>
-          <w:sz w:val="30"/>
-          <w:szCs w:val="30"/>
-        </w:rPr>
-        <w:t>!</w:t>
-      </w:r>
-    </w:p>
-    <w:p>
-      <w:pPr>
-        <w:spacing w:after="200"/>
-      </w:pPr>
-      <w:r>
-        <w:t>Dear</w:t>
-      </w:r>
-      <w:r>
-        <w:t xml:space="preserve"> [name]</w:t>
-      </w:r>
-      <w:r>
-        <w:t>,</w:t>
-      </w:r>
-    </w:p>
-    <w:p>
-      <w:pPr>
-        <w:spacing w:after="200"/>
-      </w:pPr>
-      <w:r>
-        <w:t>Welcome to the GEL.IT.UP Ambassador family! We're so excited to have you on board, and even more excited for you to open your first box.</w:t>
-      </w:r>
-      <w:r>
-        <w:t xml:space="preserve"> </w:t>
-      </w:r>
-    </w:p>
-    <w:p>
-      <w:pPr>
-        <w:spacing w:after="160"/>
+        <w:t>Welcome to the family — how to unbox &amp; get started</w:t>
+      </w:r>
+    </w:p>
+    <w:p>
+      <w:pPr>
+        <w:spacing w:after="140"/>
+      </w:pPr>
+      <w:r>
+        <w:t>Dear [Name],</w:t>
+      </w:r>
+    </w:p>
+    <w:p>
+      <w:pPr>
+        <w:spacing w:after="140"/>
+      </w:pPr>
+      <w:r>
+        <w:t>Great news — your first box is on its way! Welcome to the GEL.IT.UP Ambassador family. We're so excited to have you on board, and even more excited for you to open it.</w:t>
+      </w:r>
+    </w:p>
+    <w:p>
+      <w:pPr>
+        <w:spacing w:after="100"/>
       </w:pPr>
       <w:r>
         <w:rPr>
@@ -149,7 +131,7 @@
     </w:p>
     <w:p>
       <w:pPr>
-        <w:spacing w:after="100"/>
+        <w:spacing w:after="90"/>
       </w:pPr>
       <w:r>
         <w:rPr>
@@ -164,7 +146,7 @@
     </w:p>
     <w:p>
       <w:pPr>
-        <w:spacing w:after="100"/>
+        <w:spacing w:after="90"/>
       </w:pPr>
       <w:r>
         <w:rPr>
@@ -179,7 +161,7 @@
     </w:p>
     <w:p>
       <w:pPr>
-        <w:spacing w:after="100"/>
+        <w:spacing w:after="90"/>
       </w:pPr>
       <w:r>
         <w:rPr>
@@ -194,70 +176,22 @@
     </w:p>
     <w:p>
       <w:pPr>
-        <w:spacing w:after="100"/>
+        <w:spacing w:after="90"/>
       </w:pPr>
       <w:r>
         <w:rPr>
           <w:b/>
           <w:bCs/>
         </w:rPr>
-        <w:t>4. Use your code</w:t>
-      </w:r>
-      <w:r>
-        <w:rPr>
-          <w:b/>
-          <w:bCs/>
-        </w:rPr>
-        <w:t xml:space="preserve"> </w:t>
-      </w:r>
-      <w:r>
-        <w:rPr>
-          <w:b/>
-          <w:bCs/>
-        </w:rPr>
-        <w:t>[discount code]</w:t>
-      </w:r>
-      <w:r>
-        <w:rPr>
-          <w:b/>
-          <w:bCs/>
-        </w:rPr>
-        <w:t>.</w:t>
+        <w:t>4. Use your code.</w:t>
       </w:r>
       <w:r>
         <w:t xml:space="preserve">  Your personal discount code is included in this box — share it with your followers for 20% off.</w:t>
       </w:r>
-      <w:r>
-        <w:t xml:space="preserve"> </w:t>
-      </w:r>
-      <w:r>
-        <w:rPr>
-          <w:b/>
-          <w:bCs/>
-        </w:rPr>
-        <w:t xml:space="preserve">Please note that the discount code is only valid for </w:t>
-      </w:r>
-      <w:hyperlink r:id="rId8" w:history="1">
-        <w:r>
-          <w:rPr>
-            <w:rStyle w:val="Hyperlink"/>
-            <w:b/>
-            <w:bCs/>
-          </w:rPr>
-          <w:t>www.gelitup.com</w:t>
-        </w:r>
-      </w:hyperlink>
-      <w:r>
-        <w:rPr>
-          <w:b/>
-          <w:bCs/>
-        </w:rPr>
-        <w:t xml:space="preserve"> and not to be shared publicly but on private messages to your subscribers / followers</w:t>
-      </w:r>
-    </w:p>
-    <w:p>
-      <w:pPr>
-        <w:spacing w:after="280"/>
+    </w:p>
+    <w:p>
+      <w:pPr>
+        <w:spacing w:after="160"/>
       </w:pPr>
       <w:r>
         <w:rPr>
@@ -285,32 +219,38 @@
           <w:left w:w="10" w:type="dxa"/>
           <w:right w:w="10" w:type="dxa"/>
         </w:tblCellMar>
-        <w:tblLook w:val="0000" w:firstRow="0" w:lastRow="0" w:firstColumn="0" w:lastColumn="0" w:noHBand="0" w:noVBand="0"/>
+        <w:tblLook w:val="04A0" w:firstRow="1" w:lastRow="0" w:firstColumn="1" w:lastColumn="0" w:noHBand="0" w:noVBand="1"/>
       </w:tblPr>
       <w:tblGrid>
         <w:gridCol w:w="9360"/>
       </w:tblGrid>
       <w:tr>
+        <w:tblPrEx>
+          <w:tblCellMar>
+            <w:top w:w="0" w:type="dxa"/>
+            <w:bottom w:w="0" w:type="dxa"/>
+          </w:tblCellMar>
+        </w:tblPrEx>
         <w:tc>
           <w:tcPr>
             <w:tcW w:w="9360" w:type="dxa"/>
             <w:tcBorders>
-              <w:top w:val="single" w:sz="8" w:space="0" w:color="C34283"/>
-              <w:left w:val="single" w:sz="8" w:space="0" w:color="C34283"/>
-              <w:bottom w:val="single" w:sz="8" w:space="0" w:color="C34283"/>
-              <w:right w:val="single" w:sz="8" w:space="0" w:color="C34283"/>
+              <w:top w:val="single" w:sz="6" w:space="0" w:color="C34283"/>
+              <w:left w:val="single" w:sz="6" w:space="0" w:color="C34283"/>
+              <w:bottom w:val="single" w:sz="6" w:space="0" w:color="C34283"/>
+              <w:right w:val="single" w:sz="6" w:space="0" w:color="C34283"/>
             </w:tcBorders>
             <w:shd w:val="clear" w:color="auto" w:fill="FDEEF5"/>
             <w:tcMar>
-              <w:top w:w="200" w:type="dxa"/>
+              <w:top w:w="180" w:type="dxa"/>
               <w:left w:w="260" w:type="dxa"/>
-              <w:bottom w:w="200" w:type="dxa"/>
+              <w:bottom w:w="180" w:type="dxa"/>
               <w:right w:w="260" w:type="dxa"/>
             </w:tcMar>
           </w:tcPr>
           <w:p>
             <w:pPr>
-              <w:spacing w:after="120"/>
+              <w:spacing w:after="100"/>
             </w:pPr>
             <w:r>
               <w:rPr>
@@ -323,7 +263,7 @@
           </w:p>
           <w:p>
             <w:pPr>
-              <w:spacing w:after="80"/>
+              <w:spacing w:after="60"/>
             </w:pPr>
             <w:r>
               <w:t xml:space="preserve">•  Tag us </w:t>
@@ -351,13 +291,7 @@
           </w:p>
           <w:p>
             <w:r>
-              <w:t xml:space="preserve">•  Send your content </w:t>
-            </w:r>
-            <w:r>
-              <w:t xml:space="preserve">and your social media handles / tags </w:t>
-            </w:r>
-            <w:r>
-              <w:t xml:space="preserve">to our WhatsApp / Viber at </w:t>
+              <w:t xml:space="preserve">•  Send your content to our WhatsApp / Viber at </w:t>
             </w:r>
             <w:r>
               <w:rPr>
@@ -367,7 +301,7 @@
               <w:t>+30 694 071 5234</w:t>
             </w:r>
             <w:r>
-              <w:t xml:space="preserve"> as well — this way we can share it directly and make sure you're tagged.</w:t>
+              <w:t xml:space="preserve"> too — this way we can share it directly and make sure you're tagged.</w:t>
             </w:r>
           </w:p>
         </w:tc>
@@ -375,96 +309,305 @@
     </w:tbl>
     <w:p>
       <w:pPr>
-        <w:spacing w:after="200"/>
-      </w:pPr>
-    </w:p>
-    <w:p>
-      <w:pPr>
-        <w:spacing w:after="200"/>
-      </w:pPr>
-      <w:r>
-        <w:t xml:space="preserve">As a reminder, here's what you get as a </w:t>
+        <w:spacing w:after="220"/>
+      </w:pPr>
+    </w:p>
+    <w:p>
+      <w:pPr>
+        <w:spacing w:after="100"/>
+      </w:pPr>
+      <w:r>
+        <w:rPr>
+          <w:b/>
+          <w:bCs/>
+          <w:sz w:val="24"/>
+          <w:szCs w:val="24"/>
+        </w:rPr>
+        <w:t>Your B2B Ambassador account</w:t>
+      </w:r>
+    </w:p>
+    <w:p>
+      <w:pPr>
+        <w:spacing w:after="90"/>
+      </w:pPr>
+      <w:r>
+        <w:t xml:space="preserve">You're already registered on the GEL.IT.UP B2B </w:t>
+      </w:r>
+      <w:proofErr w:type="gramStart"/>
+      <w:r>
+        <w:t>Portal —</w:t>
+      </w:r>
+      <w:proofErr w:type="gramEnd"/>
+      <w:r>
+        <w:t xml:space="preserve"> there's nothing new to sign up for. You just need to log in:</w:t>
+      </w:r>
+    </w:p>
+    <w:p>
+      <w:pPr>
+        <w:spacing w:after="50"/>
+      </w:pPr>
+      <w:r>
+        <w:t xml:space="preserve">1. Go to </w:t>
       </w:r>
       <w:r>
         <w:rPr>
           <w:b/>
           <w:bCs/>
         </w:rPr>
-        <w:t>GEL.IT.UP Ambassador</w:t>
-      </w:r>
+        <w:t>gelitup.com/portal/login</w:t>
+      </w:r>
+      <w:r>
+        <w:t>.</w:t>
+      </w:r>
+    </w:p>
+    <w:p>
+      <w:pPr>
+        <w:spacing w:after="50"/>
+      </w:pPr>
+      <w:r>
+        <w:t>2. Enter your email address and the password you set when you activated your account (from your welcome email).</w:t>
+      </w:r>
+    </w:p>
+    <w:p>
+      <w:pPr>
+        <w:spacing w:after="160"/>
+      </w:pPr>
+      <w:r>
+        <w:t xml:space="preserve">3. Haven't set a password yet, or forgotten it? </w:t>
+      </w:r>
+      <w:r>
+        <w:rPr>
+          <w:b/>
+          <w:bCs/>
+        </w:rPr>
+        <w:t>Click "Forgot password"</w:t>
+      </w:r>
+      <w:r>
+        <w:t xml:space="preserve"> on that same page and we'll send you a reset link.</w:t>
+      </w:r>
+    </w:p>
+    <w:tbl>
+      <w:tblPr>
+        <w:tblW w:w="9360" w:type="dxa"/>
+        <w:tblBorders>
+          <w:top w:val="single" w:sz="4" w:space="0" w:color="auto"/>
+          <w:left w:val="single" w:sz="4" w:space="0" w:color="auto"/>
+          <w:bottom w:val="single" w:sz="4" w:space="0" w:color="auto"/>
+          <w:right w:val="single" w:sz="4" w:space="0" w:color="auto"/>
+          <w:insideH w:val="single" w:sz="4" w:space="0" w:color="auto"/>
+          <w:insideV w:val="single" w:sz="4" w:space="0" w:color="auto"/>
+        </w:tblBorders>
+        <w:tblCellMar>
+          <w:left w:w="10" w:type="dxa"/>
+          <w:right w:w="10" w:type="dxa"/>
+        </w:tblCellMar>
+        <w:tblLook w:val="04A0" w:firstRow="1" w:lastRow="0" w:firstColumn="1" w:lastColumn="0" w:noHBand="0" w:noVBand="1"/>
+      </w:tblPr>
+      <w:tblGrid>
+        <w:gridCol w:w="9360"/>
+      </w:tblGrid>
+      <w:tr>
+        <w:tblPrEx>
+          <w:tblCellMar>
+            <w:top w:w="0" w:type="dxa"/>
+            <w:bottom w:w="0" w:type="dxa"/>
+          </w:tblCellMar>
+        </w:tblPrEx>
+        <w:tc>
+          <w:tcPr>
+            <w:tcW w:w="9360" w:type="dxa"/>
+            <w:tcBorders>
+              <w:top w:val="dashed" w:sz="6" w:space="0" w:color="C34283"/>
+              <w:left w:val="dashed" w:sz="6" w:space="0" w:color="C34283"/>
+              <w:bottom w:val="dashed" w:sz="6" w:space="0" w:color="C34283"/>
+              <w:right w:val="dashed" w:sz="6" w:space="0" w:color="C34283"/>
+            </w:tcBorders>
+            <w:shd w:val="clear" w:color="auto" w:fill="FDEEF5"/>
+            <w:tcMar>
+              <w:top w:w="180" w:type="dxa"/>
+              <w:left w:w="260" w:type="dxa"/>
+              <w:bottom w:w="180" w:type="dxa"/>
+              <w:right w:w="260" w:type="dxa"/>
+            </w:tcMar>
+          </w:tcPr>
+          <w:p>
+            <w:pPr>
+              <w:spacing w:after="30"/>
+              <w:jc w:val="center"/>
+            </w:pPr>
+            <w:r>
+              <w:rPr>
+                <w:b/>
+                <w:bCs/>
+                <w:color w:val="C34283"/>
+                <w:sz w:val="32"/>
+                <w:szCs w:val="32"/>
+              </w:rPr>
+              <w:t>[CODE]</w:t>
+            </w:r>
+          </w:p>
+          <w:p>
+            <w:pPr>
+              <w:jc w:val="center"/>
+            </w:pPr>
+            <w:r>
+              <w:rPr>
+                <w:color w:val="6B6B6B"/>
+                <w:sz w:val="18"/>
+                <w:szCs w:val="18"/>
+              </w:rPr>
+              <w:t>your code — share it with your clients</w:t>
+            </w:r>
+          </w:p>
+        </w:tc>
+      </w:tr>
+    </w:tbl>
+    <w:p>
+      <w:pPr>
+        <w:spacing w:after="200"/>
+      </w:pPr>
+    </w:p>
+    <w:p>
+      <w:pPr>
+        <w:spacing w:after="100"/>
+      </w:pPr>
+      <w:r>
+        <w:rPr>
+          <w:b/>
+          <w:bCs/>
+          <w:sz w:val="24"/>
+          <w:szCs w:val="24"/>
+        </w:rPr>
+        <w:t>How your dashboard works</w:t>
+      </w:r>
+    </w:p>
+    <w:p>
+      <w:pPr>
+        <w:spacing w:after="90"/>
+      </w:pPr>
+      <w:r>
+        <w:rPr>
+          <w:b/>
+          <w:bCs/>
+        </w:rPr>
+        <w:t xml:space="preserve">1. Share your code.  </w:t>
+      </w:r>
+      <w:r>
+        <w:t>Give [CODE] to your clients — they enter it at checkout on gelitup.com.</w:t>
+      </w:r>
+    </w:p>
+    <w:p>
+      <w:pPr>
+        <w:spacing w:after="90"/>
+      </w:pPr>
+      <w:r>
+        <w:rPr>
+          <w:b/>
+          <w:bCs/>
+        </w:rPr>
+        <w:t xml:space="preserve">2. Your clients always save 20%.  </w:t>
+      </w:r>
+      <w:r>
+        <w:t>Every order placed with [CODE] gets a flat 20% off — no conditions, no minimums for them.</w:t>
+      </w:r>
+    </w:p>
+    <w:p>
+      <w:pPr>
+        <w:spacing w:after="160"/>
+      </w:pPr>
+      <w:r>
+        <w:rPr>
+          <w:b/>
+          <w:bCs/>
+        </w:rPr>
+        <w:t xml:space="preserve">3. Your commission climbs the more you sell.  </w:t>
+      </w:r>
+      <w:r>
+        <w:t xml:space="preserve">You start earning 10% commission on every order placed with your code. Once the total value of orders through your code reaches €1,000, your commission rises to 15%. Once it </w:t>
+      </w:r>
+      <w:r>
+        <w:lastRenderedPageBreak/>
+        <w:t xml:space="preserve">reaches €2,000, it rises to 20% — the highest tier. Your commission lands in your account as credit </w:t>
+      </w:r>
+      <w:proofErr w:type="gramStart"/>
+      <w:r>
+        <w:t>automatically, and</w:t>
+      </w:r>
+      <w:proofErr w:type="gramEnd"/>
+      <w:r>
+        <w:t xml:space="preserve"> is applied to reduce your own next GEL.IT.UP order at </w:t>
+      </w:r>
+      <w:proofErr w:type="gramStart"/>
+      <w:r>
+        <w:t>checkout — you</w:t>
+      </w:r>
+      <w:proofErr w:type="gramEnd"/>
+      <w:r>
+        <w:t xml:space="preserve"> don't need to do anything to claim it.</w:t>
+      </w:r>
+    </w:p>
+    <w:p>
+      <w:pPr>
+        <w:spacing w:after="90"/>
+      </w:pPr>
+      <w:r>
+        <w:t xml:space="preserve">Log in to your account any time to </w:t>
+      </w:r>
+      <w:proofErr w:type="gramStart"/>
+      <w:r>
+        <w:t>see,</w:t>
+      </w:r>
+      <w:proofErr w:type="gramEnd"/>
+      <w:r>
+        <w:t xml:space="preserve"> </w:t>
+      </w:r>
+      <w:proofErr w:type="gramStart"/>
+      <w:r>
+        <w:t>at a glance</w:t>
+      </w:r>
+      <w:proofErr w:type="gramEnd"/>
       <w:r>
         <w:t>:</w:t>
       </w:r>
     </w:p>
     <w:p>
       <w:pPr>
-        <w:spacing w:after="80"/>
-      </w:pPr>
-      <w:r>
-        <w:t>•  Free product drops, sent before anyone else</w:t>
-      </w:r>
-    </w:p>
-    <w:p>
-      <w:pPr>
-        <w:spacing w:after="80"/>
-      </w:pPr>
-      <w:r>
-        <w:t>•  Your own personal discount code, plus 20% off to share with your followers</w:t>
-      </w:r>
-      <w:r>
-        <w:t xml:space="preserve"> </w:t>
-      </w:r>
-    </w:p>
-    <w:p>
-      <w:pPr>
-        <w:spacing w:after="240"/>
-      </w:pPr>
-      <w:r>
-        <w:t xml:space="preserve">•  Your posts </w:t>
-      </w:r>
-      <w:proofErr w:type="gramStart"/>
-      <w:r>
-        <w:t>featured to</w:t>
-      </w:r>
-      <w:proofErr w:type="gramEnd"/>
-      <w:r>
-        <w:t xml:space="preserve"> thousands </w:t>
-      </w:r>
-      <w:proofErr w:type="gramStart"/>
-      <w:r>
-        <w:t>on @gelitupinternational</w:t>
-      </w:r>
-      <w:r>
-        <w:t xml:space="preserve"> #</w:t>
-      </w:r>
-      <w:proofErr w:type="gramEnd"/>
-      <w:r>
-        <w:t>gelitup</w:t>
-      </w:r>
-      <w:r>
-        <w:t xml:space="preserve"> and other country social media platforms!</w:t>
-      </w:r>
-    </w:p>
-    <w:p>
-      <w:pPr>
-        <w:spacing w:after="240"/>
-      </w:pPr>
-      <w:r>
-        <w:t>Please remember that you are representing a company who is mutually supporting you and we appreciate professional content.  If you have any questions at all, just reply to this email or message us directly — we're always here to help.</w:t>
-      </w:r>
-    </w:p>
-    <w:p>
-      <w:pPr>
-        <w:spacing w:after="240"/>
-      </w:pPr>
-      <w:r>
-        <w:t>Welcome to the family,</w:t>
-      </w:r>
-      <w:r>
-        <w:t>[name]</w:t>
-      </w:r>
-      <w:r>
-        <w:t>. We can't wait to see what you create.</w:t>
+        <w:spacing w:after="60"/>
+      </w:pPr>
+      <w:r>
+        <w:t>•  Your discount code, ready to share</w:t>
+      </w:r>
+    </w:p>
+    <w:p>
+      <w:pPr>
+        <w:spacing w:after="60"/>
+      </w:pPr>
+      <w:r>
+        <w:t>•  Your available credit, ready to use on your next order</w:t>
+      </w:r>
+    </w:p>
+    <w:p>
+      <w:pPr>
+        <w:spacing w:after="200"/>
+      </w:pPr>
+      <w:r>
+        <w:t>•  Your current commission tier, and how close you are to the next one</w:t>
+      </w:r>
+    </w:p>
+    <w:p>
+      <w:pPr>
+        <w:spacing w:after="200"/>
+      </w:pPr>
+      <w:r>
+        <w:t>If you have any questions at all, just reply to this email or message us directly — we're always here to help.</w:t>
+      </w:r>
+    </w:p>
+    <w:p>
+      <w:pPr>
+        <w:spacing w:after="200"/>
+      </w:pPr>
+      <w:r>
+        <w:t>Welcome to the family, [Name]. We can't wait to see what you create.</w:t>
       </w:r>
     </w:p>
     <w:p>
@@ -485,9 +628,9 @@
       </w:r>
     </w:p>
     <w:sectPr>
-      <w:footerReference w:type="default" r:id="rId9"/>
+      <w:footerReference w:type="default" r:id="rId8"/>
       <w:pgSz w:w="12240" w:h="15840"/>
-      <w:pgMar w:top="720" w:right="1440" w:bottom="900" w:left="1440" w:header="708" w:footer="708" w:gutter="0"/>
+      <w:pgMar w:top="560" w:right="1440" w:bottom="700" w:left="1440" w:header="708" w:footer="708" w:gutter="0"/>
       <w:cols w:space="720"/>
       <w:docGrid w:linePitch="360"/>
     </w:sectPr>
@@ -578,10 +721,10 @@
 <file path=word/numbering.xml><?xml version="1.0" encoding="utf-8"?>
 <w:numbering xmlns:wpc="http://schemas.microsoft.com/office/word/2010/wordprocessingCanvas" xmlns:cx="http://schemas.microsoft.com/office/drawing/2014/chartex" xmlns:cx1="http://schemas.microsoft.com/office/drawing/2015/9/8/chartex" xmlns:cx2="http://schemas.microsoft.com/office/drawing/2015/10/21/chartex" xmlns:cx3="http://schemas.microsoft.com/office/drawing/2016/5/9/chartex" xmlns:cx4="http://schemas.microsoft.com/office/drawing/2016/5/10/chartex" xmlns:cx5="http://schemas.microsoft.com/office/drawing/2016/5/11/chartex" xmlns:cx6="http://schemas.microsoft.com/office/drawing/2016/5/12/chartex" xmlns:cx7="http://schemas.microsoft.com/office/drawing/2016/5/13/chartex" xmlns:cx8="http://schemas.microsoft.com/office/drawing/2016/5/14/chartex" xmlns:mc="http://schemas.openxmlformats.org/markup-compatibility/2006" xmlns:aink="http://schemas.microsoft.com/office/drawing/2016/ink" xmlns:am3d="http://schemas.microsoft.com/office/drawing/2017/model3d" xmlns:o="urn:schemas-microsoft-com:office:office" xmlns:oel="http://schemas.microsoft.com/office/2019/extlst" xmlns:r="http://schemas.openxmlformats.org/officeDocument/2006/relationships" xmlns:m="http://schemas.openxmlformats.org/officeDocument/2006/math" xmlns:v="urn:schemas-microsoft-com:vml" xmlns:wp14="http://schemas.microsoft.com/office/word/2010/wordprocessingDrawing" xmlns:wp="http://schemas.openxmlformats.org/drawingml/2006/wordprocessingDrawing" xmlns:w10="urn:schemas-microsoft-com:office:word" xmlns:w="http://schemas.openxmlformats.org/wordprocessingml/2006/main" xmlns:w14="http://schemas.microsoft.com/office/word/2010/wordml" xmlns:w15="http://schemas.microsoft.com/office/word/2012/wordml" xmlns:w16cei="http://schemas.microsoft.com/office/word/2026/wordml/cei" xmlns:w16cex="http://schemas.microsoft.com/office/word/2018/wordml/cex" xmlns:w16cid="http://schemas.microsoft.com/office/word/2016/wordml/cid" xmlns:w16="http://schemas.microsoft.com/office/word/2018/wordml" xmlns:w16du="http://schemas.microsoft.com/office/word/2023/wordml/word16du" xmlns:w16sdtdh="http://schemas.microsoft.com/office/word/2020/wordml/sdtdatahash" xmlns:w16sdtfl="http://schemas.microsoft.com/office/word/2024/wordml/sdtformatlock" xmlns:w16se="http://schemas.microsoft.com/office/word/2015/wordml/symex" xmlns:wpg="http://schemas.microsoft.com/office/word/2010/wordprocessingGroup" xmlns:wpi="http://schemas.microsoft.com/office/word/2010/wordprocessingInk" xmlns:wne="http://schemas.microsoft.com/office/word/2006/wordml" xmlns:wps="http://schemas.microsoft.com/office/word/2010/wordprocessingShape" mc:Ignorable="w14 w15 w16se w16cid w16 w16cex w16sdtdh w16sdtfl w16du wp14">
   <w:abstractNum w:abstractNumId="0" w15:restartNumberingAfterBreak="0">
-    <w:nsid w:val="0DD2641A"/>
+    <w:nsid w:val="64526B78"/>
     <w:multiLevelType w:val="hybridMultilevel"/>
-    <w:tmpl w:val="F16C5C1E"/>
-    <w:lvl w:ilvl="0" w:tplc="833E5518">
+    <w:tmpl w:val="4AFADA62"/>
+    <w:lvl w:ilvl="0" w:tplc="7D4AFE00">
       <w:start w:val="1"/>
       <w:numFmt w:val="bullet"/>
       <w:lvlText w:val="●"/>
@@ -590,7 +733,7 @@
         <w:ind w:left="720" w:hanging="360"/>
       </w:pPr>
     </w:lvl>
-    <w:lvl w:ilvl="1" w:tplc="C9D201C6">
+    <w:lvl w:ilvl="1" w:tplc="EF449D52">
       <w:start w:val="1"/>
       <w:numFmt w:val="bullet"/>
       <w:lvlText w:val="○"/>
@@ -599,7 +742,7 @@
         <w:ind w:left="1440" w:hanging="360"/>
       </w:pPr>
     </w:lvl>
-    <w:lvl w:ilvl="2" w:tplc="8AC2AD92">
+    <w:lvl w:ilvl="2" w:tplc="03DA0168">
       <w:start w:val="1"/>
       <w:numFmt w:val="bullet"/>
       <w:lvlText w:val="■"/>
@@ -608,7 +751,7 @@
         <w:ind w:left="2160" w:hanging="360"/>
       </w:pPr>
     </w:lvl>
-    <w:lvl w:ilvl="3" w:tplc="3F66B5C2">
+    <w:lvl w:ilvl="3" w:tplc="4CC204D2">
       <w:start w:val="1"/>
       <w:numFmt w:val="bullet"/>
       <w:lvlText w:val="●"/>
@@ -617,7 +760,7 @@
         <w:ind w:left="2880" w:hanging="360"/>
       </w:pPr>
     </w:lvl>
-    <w:lvl w:ilvl="4" w:tplc="60A038CA">
+    <w:lvl w:ilvl="4" w:tplc="45705624">
       <w:start w:val="1"/>
       <w:numFmt w:val="bullet"/>
       <w:lvlText w:val="○"/>
@@ -626,7 +769,7 @@
         <w:ind w:left="3600" w:hanging="360"/>
       </w:pPr>
     </w:lvl>
-    <w:lvl w:ilvl="5" w:tplc="22EC3756">
+    <w:lvl w:ilvl="5" w:tplc="14D80F0E">
       <w:start w:val="1"/>
       <w:numFmt w:val="bullet"/>
       <w:lvlText w:val="■"/>
@@ -635,7 +778,7 @@
         <w:ind w:left="4320" w:hanging="360"/>
       </w:pPr>
     </w:lvl>
-    <w:lvl w:ilvl="6" w:tplc="6DA4979E">
+    <w:lvl w:ilvl="6" w:tplc="E0C0B3CC">
       <w:start w:val="1"/>
       <w:numFmt w:val="bullet"/>
       <w:lvlText w:val="●"/>
@@ -644,7 +787,7 @@
         <w:ind w:left="5040" w:hanging="360"/>
       </w:pPr>
     </w:lvl>
-    <w:lvl w:ilvl="7" w:tplc="184C64C6">
+    <w:lvl w:ilvl="7" w:tplc="2D708034">
       <w:start w:val="1"/>
       <w:numFmt w:val="bullet"/>
       <w:lvlText w:val="●"/>
@@ -653,7 +796,7 @@
         <w:ind w:left="5760" w:hanging="360"/>
       </w:pPr>
     </w:lvl>
-    <w:lvl w:ilvl="8" w:tplc="93883E40">
+    <w:lvl w:ilvl="8" w:tplc="B88A3BEC">
       <w:start w:val="1"/>
       <w:numFmt w:val="bullet"/>
       <w:lvlText w:val="●"/>
@@ -663,7 +806,7 @@
       </w:pPr>
     </w:lvl>
   </w:abstractNum>
-  <w:num w:numId="1" w16cid:durableId="1355376671">
+  <w:num w:numId="1" w16cid:durableId="7369691">
     <w:abstractNumId w:val="0"/>
     <w:lvlOverride w:ilvl="0">
       <w:startOverride w:val="1"/>
@@ -1260,18 +1403,6 @@
       <w:szCs w:val="20"/>
     </w:rPr>
   </w:style>
-  <w:style w:type="character" w:styleId="UnresolvedMention">
-    <w:name w:val="Unresolved Mention"/>
-    <w:basedOn w:val="DefaultParagraphFont"/>
-    <w:uiPriority w:val="99"/>
-    <w:semiHidden/>
-    <w:unhideWhenUsed/>
-    <w:rsid w:val="00D04C09"/>
-    <w:rPr>
-      <w:color w:val="605E5C"/>
-      <w:shd w:val="clear" w:color="auto" w:fill="E1DFDD"/>
-    </w:rPr>
-  </w:style>
 </w:styles>
 </file>
 

</xml_diff>